<commit_message>
Objectif du sprint 1
</commit_message>
<xml_diff>
--- a/docs/rendus/Séance 1.docx
+++ b/docs/rendus/Séance 1.docx
@@ -3434,10 +3434,7 @@
     </w:tbl>
     <w:p>
       <w:r>
-        <w:t xml:space="preserve">Estimation = </w:t>
-      </w:r>
-      <w:r>
-        <w:t>1</w:t>
+        <w:t>Estimation = 1</w:t>
       </w:r>
     </w:p>
     <w:p>
@@ -4096,11 +4093,9 @@
             <w:tcW w:w="3021" w:type="dxa"/>
           </w:tcPr>
           <w:p>
-            <w:proofErr w:type="gramStart"/>
             <w:r>
               <w:t>½</w:t>
             </w:r>
-            <w:proofErr w:type="gramEnd"/>
           </w:p>
         </w:tc>
         <w:tc>
@@ -4130,11 +4125,9 @@
             <w:tcW w:w="3021" w:type="dxa"/>
           </w:tcPr>
           <w:p>
-            <w:proofErr w:type="gramStart"/>
             <w:r>
               <w:t>½</w:t>
             </w:r>
-            <w:proofErr w:type="gramEnd"/>
           </w:p>
         </w:tc>
         <w:tc>
@@ -4142,11 +4135,9 @@
             <w:tcW w:w="3021" w:type="dxa"/>
           </w:tcPr>
           <w:p>
-            <w:proofErr w:type="gramStart"/>
             <w:r>
               <w:t>½</w:t>
             </w:r>
-            <w:proofErr w:type="gramEnd"/>
           </w:p>
         </w:tc>
       </w:tr>
@@ -4157,6 +4148,49 @@
       </w:r>
       <w:r>
         <w:t>1/2</w:t>
+      </w:r>
+    </w:p>
+    <w:p>
+      <w:pPr>
+        <w:tabs>
+          <w:tab w:val="left" w:pos="1545"/>
+        </w:tabs>
+      </w:pPr>
+      <w:r>
+        <w:tab/>
+      </w:r>
+    </w:p>
+    <w:p>
+      <w:pPr>
+        <w:tabs>
+          <w:tab w:val="left" w:pos="1545"/>
+        </w:tabs>
+      </w:pPr>
+    </w:p>
+    <w:p>
+      <w:pPr>
+        <w:tabs>
+          <w:tab w:val="left" w:pos="1545"/>
+        </w:tabs>
+      </w:pPr>
+      <w:r>
+        <w:rPr>
+          <w:b/>
+          <w:bCs/>
+        </w:rPr>
+        <w:lastRenderedPageBreak/>
+        <w:t>Objectif du sprint 1 :</w:t>
+      </w:r>
+      <w:r>
+        <w:t xml:space="preserve"> Une équipe réunie autour d’un même ordinateur peut lancer une partie avec ses pseudos, charger son </w:t>
+      </w:r>
+      <w:proofErr w:type="spellStart"/>
+      <w:r>
+        <w:t>backlog</w:t>
+      </w:r>
+      <w:proofErr w:type="spellEnd"/>
+      <w:r>
+        <w:t xml:space="preserve"> et voter en secret sur chaque fonctionnalité, puis découvrir tous les votes en même temps.</w:t>
       </w:r>
     </w:p>
     <w:sectPr>
@@ -7908,7 +7942,7 @@
           </w:pPr>
           <w:r>
             <w:rPr>
-              <w:color w:val="0F4761" w:themeColor="accent1" w:themeShade="BF"/>
+              <w:color w:val="2F5496" w:themeColor="accent1" w:themeShade="BF"/>
             </w:rPr>
             <w:t>[Nom de la société]</w:t>
           </w:r>
@@ -7938,7 +7972,7 @@
           <w:r>
             <w:rPr>
               <w:rFonts w:asciiTheme="majorHAnsi" w:eastAsiaTheme="majorEastAsia" w:hAnsiTheme="majorHAnsi" w:cstheme="majorBidi"/>
-              <w:color w:val="156082" w:themeColor="accent1"/>
+              <w:color w:val="4472C4" w:themeColor="accent1"/>
               <w:sz w:val="88"/>
               <w:szCs w:val="88"/>
             </w:rPr>
@@ -7969,7 +8003,7 @@
           </w:pPr>
           <w:r>
             <w:rPr>
-              <w:color w:val="0F4761" w:themeColor="accent1" w:themeShade="BF"/>
+              <w:color w:val="2F5496" w:themeColor="accent1" w:themeShade="BF"/>
             </w:rPr>
             <w:t>[Sous-titre du document]</w:t>
           </w:r>
@@ -7998,7 +8032,7 @@
           </w:pPr>
           <w:r>
             <w:rPr>
-              <w:color w:val="156082" w:themeColor="accent1"/>
+              <w:color w:val="4472C4" w:themeColor="accent1"/>
               <w:sz w:val="28"/>
               <w:szCs w:val="28"/>
             </w:rPr>
@@ -8029,7 +8063,7 @@
           </w:pPr>
           <w:r>
             <w:rPr>
-              <w:color w:val="156082" w:themeColor="accent1"/>
+              <w:color w:val="4472C4" w:themeColor="accent1"/>
               <w:sz w:val="28"/>
               <w:szCs w:val="28"/>
             </w:rPr>
@@ -8080,7 +8114,7 @@
   </w:font>
   <w:font w:name="Sofia Pro">
     <w:altName w:val="Calibri"/>
-    <w:panose1 w:val="02000000000000000000"/>
+    <w:panose1 w:val="00000000000000000000"/>
     <w:charset w:val="00"/>
     <w:family w:val="modern"/>
     <w:notTrueType/>
@@ -8089,7 +8123,6 @@
   </w:font>
   <w:font w:name="TT Neoris Trial">
     <w:altName w:val="Calibri"/>
-    <w:panose1 w:val="020B0003030000020004"/>
     <w:charset w:val="00"/>
     <w:family w:val="swiss"/>
     <w:pitch w:val="variable"/>
@@ -8103,7 +8136,6 @@
   </w:font>
   <w:font w:name="OCR-A BT">
     <w:altName w:val="Calibri"/>
-    <w:panose1 w:val="020F0501020204020304"/>
     <w:charset w:val="00"/>
     <w:family w:val="swiss"/>
     <w:pitch w:val="variable"/>
@@ -8122,6 +8154,13 @@
     <w:family w:val="modern"/>
     <w:pitch w:val="fixed"/>
     <w:sig w:usb0="8000028F" w:usb1="00001800" w:usb2="00000000" w:usb3="00000000" w:csb0="0000001F" w:csb1="00000000"/>
+  </w:font>
+  <w:font w:name="Calibri Light">
+    <w:panose1 w:val="020F0302020204030204"/>
+    <w:charset w:val="00"/>
+    <w:family w:val="swiss"/>
+    <w:pitch w:val="variable"/>
+    <w:sig w:usb0="E4002EFF" w:usb1="C200247B" w:usb2="00000009" w:usb3="00000000" w:csb0="000001FF" w:csb1="00000000"/>
   </w:font>
 </w:fonts>
 </file>
@@ -8145,8 +8184,10 @@
     <w:rsidRoot w:val="006E64CE"/>
     <w:rsid w:val="00113869"/>
     <w:rsid w:val="002F62BC"/>
+    <w:rsid w:val="004F31F8"/>
     <w:rsid w:val="005259C0"/>
     <w:rsid w:val="006E64CE"/>
+    <w:rsid w:val="00785775"/>
     <w:rsid w:val="00B021F1"/>
     <w:rsid w:val="00E71964"/>
     <w:rsid w:val="00FF69E9"/>

</xml_diff>

<commit_message>
docs(DoD): écart assumé sur les tests au sprint 1
Conditions 1 et 3 (tests xUnit) non appliquées aux US du sprint 1 (US-01, US-03, US-05).
Projet de tests prévu en séance 2.
</commit_message>
<xml_diff>
--- a/docs/rendus/Séance 1.docx
+++ b/docs/rendus/Séance 1.docx
@@ -1940,29 +1940,35 @@
                 <w:sz w:val="20"/>
                 <w:szCs w:val="22"/>
               </w:rPr>
-              <w:t xml:space="preserve">En tant qu'animateur de la partie, je veux charger un </w:t>
-            </w:r>
-            <w:proofErr w:type="spellStart"/>
-            <w:r>
+              <w:t>En tant qu'animateur de la partie, je veux charger un backlog au format JSON afin de ne pas ressaisir les fonctionnalités à estimer.</w:t>
+            </w:r>
+          </w:p>
+        </w:tc>
+        <w:tc>
+          <w:tcPr>
+            <w:tcW w:w="2126" w:type="dxa"/>
+          </w:tcPr>
+          <w:p>
+            <w:pPr>
               <w:rPr>
                 <w:sz w:val="20"/>
                 <w:szCs w:val="22"/>
               </w:rPr>
-              <w:t>backlog</w:t>
-            </w:r>
-            <w:proofErr w:type="spellEnd"/>
+            </w:pPr>
             <w:r>
               <w:rPr>
                 <w:sz w:val="20"/>
                 <w:szCs w:val="22"/>
               </w:rPr>
-              <w:t xml:space="preserve"> au format JSON afin de ne pas ressaisir les fonctionnalités à estimer.</w:t>
-            </w:r>
-          </w:p>
-        </w:tc>
-        <w:tc>
-          <w:tcPr>
-            <w:tcW w:w="2126" w:type="dxa"/>
+              <w:t>CU-01 étapes 3 et 4</w:t>
+            </w:r>
+          </w:p>
+        </w:tc>
+      </w:tr>
+      <w:tr>
+        <w:tc>
+          <w:tcPr>
+            <w:tcW w:w="879" w:type="dxa"/>
           </w:tcPr>
           <w:p>
             <w:pPr>
@@ -1976,7 +1982,47 @@
                 <w:sz w:val="20"/>
                 <w:szCs w:val="22"/>
               </w:rPr>
-              <w:t>CU-01 étapes 3 et 4</w:t>
+              <w:t>US-05</w:t>
+            </w:r>
+          </w:p>
+        </w:tc>
+        <w:tc>
+          <w:tcPr>
+            <w:tcW w:w="6057" w:type="dxa"/>
+          </w:tcPr>
+          <w:p>
+            <w:pPr>
+              <w:rPr>
+                <w:sz w:val="20"/>
+                <w:szCs w:val="22"/>
+              </w:rPr>
+            </w:pPr>
+            <w:r>
+              <w:rPr>
+                <w:sz w:val="20"/>
+                <w:szCs w:val="22"/>
+              </w:rPr>
+              <w:t>En tant que joueur, je veux choisir ma carte sans voir les votes des autres, puis voir tous les votes révélés en même temps, afin que mon estimation ne soit pas influencée.</w:t>
+            </w:r>
+          </w:p>
+        </w:tc>
+        <w:tc>
+          <w:tcPr>
+            <w:tcW w:w="2126" w:type="dxa"/>
+          </w:tcPr>
+          <w:p>
+            <w:pPr>
+              <w:rPr>
+                <w:sz w:val="20"/>
+                <w:szCs w:val="22"/>
+              </w:rPr>
+            </w:pPr>
+            <w:r>
+              <w:rPr>
+                <w:sz w:val="20"/>
+                <w:szCs w:val="22"/>
+              </w:rPr>
+              <w:t>CU-02 étapes 2 et 3</w:t>
             </w:r>
           </w:p>
         </w:tc>
@@ -1998,7 +2044,7 @@
                 <w:sz w:val="20"/>
                 <w:szCs w:val="22"/>
               </w:rPr>
-              <w:t>US-05</w:t>
+              <w:t>US-06</w:t>
             </w:r>
           </w:p>
         </w:tc>
@@ -2018,7 +2064,7 @@
                 <w:sz w:val="20"/>
                 <w:szCs w:val="22"/>
               </w:rPr>
-              <w:t>En tant que joueur, je veux choisir ma carte sans voir les votes des autres, puis voir tous les votes révélés en même temps, afin que mon estimation ne soit pas influencée.</w:t>
+              <w:t>En tant que membre de l’équipe, je veux qu’une fonctionnalité ne soit validée au premier tour que si tous les votes sont identiques, afin de garantir une discussion en cas de désaccord.</w:t>
             </w:r>
           </w:p>
         </w:tc>
@@ -2038,7 +2084,7 @@
                 <w:sz w:val="20"/>
                 <w:szCs w:val="22"/>
               </w:rPr>
-              <w:t>CU-02 étapes 2 et 3</w:t>
+              <w:t>CU-02 étape 4</w:t>
             </w:r>
           </w:p>
         </w:tc>
@@ -2060,7 +2106,7 @@
                 <w:sz w:val="20"/>
                 <w:szCs w:val="22"/>
               </w:rPr>
-              <w:t>US-06</w:t>
+              <w:t>US-07</w:t>
             </w:r>
           </w:p>
         </w:tc>
@@ -2080,7 +2126,7 @@
                 <w:sz w:val="20"/>
                 <w:szCs w:val="22"/>
               </w:rPr>
-              <w:t>En tant que membre de l’équipe, je veux qu’une fonctionnalité ne soit validée au premier tour que si tous les votes sont identiques, afin de garantir une discussion en cas de désaccord.</w:t>
+              <w:t>En tant que membre de l’équipe, je veux qu’à partir du deuxième tour, avec la règle médiane, la difficulté retenue soit la médiane des votes, afin de ne pas bloquer sur un désaccord mineur.</w:t>
             </w:r>
           </w:p>
         </w:tc>
@@ -2100,7 +2146,7 @@
                 <w:sz w:val="20"/>
                 <w:szCs w:val="22"/>
               </w:rPr>
-              <w:t>CU-02 étape 4</w:t>
+              <w:t>CU-02 extension 4c</w:t>
             </w:r>
           </w:p>
         </w:tc>
@@ -2122,7 +2168,7 @@
                 <w:sz w:val="20"/>
                 <w:szCs w:val="22"/>
               </w:rPr>
-              <w:t>US-07</w:t>
+              <w:t>US-09</w:t>
             </w:r>
           </w:p>
         </w:tc>
@@ -2142,85 +2188,7 @@
                 <w:sz w:val="20"/>
                 <w:szCs w:val="22"/>
               </w:rPr>
-              <w:t>En tant que membre de l’équipe, je veux qu’à partir du deuxième tour, avec la règle médiane, la difficulté retenue soit la médiane des votes, afin de ne pas bloquer sur un désaccord mineur.</w:t>
-            </w:r>
-          </w:p>
-        </w:tc>
-        <w:tc>
-          <w:tcPr>
-            <w:tcW w:w="2126" w:type="dxa"/>
-          </w:tcPr>
-          <w:p>
-            <w:pPr>
-              <w:rPr>
-                <w:sz w:val="20"/>
-                <w:szCs w:val="22"/>
-              </w:rPr>
-            </w:pPr>
-            <w:r>
-              <w:rPr>
-                <w:sz w:val="20"/>
-                <w:szCs w:val="22"/>
-              </w:rPr>
-              <w:t>CU-02 extension 4c</w:t>
-            </w:r>
-          </w:p>
-        </w:tc>
-      </w:tr>
-      <w:tr>
-        <w:tc>
-          <w:tcPr>
-            <w:tcW w:w="879" w:type="dxa"/>
-          </w:tcPr>
-          <w:p>
-            <w:pPr>
-              <w:rPr>
-                <w:sz w:val="20"/>
-                <w:szCs w:val="22"/>
-              </w:rPr>
-            </w:pPr>
-            <w:r>
-              <w:rPr>
-                <w:sz w:val="20"/>
-                <w:szCs w:val="22"/>
-              </w:rPr>
-              <w:t>US-09</w:t>
-            </w:r>
-          </w:p>
-        </w:tc>
-        <w:tc>
-          <w:tcPr>
-            <w:tcW w:w="6057" w:type="dxa"/>
-          </w:tcPr>
-          <w:p>
-            <w:pPr>
-              <w:rPr>
-                <w:sz w:val="20"/>
-                <w:szCs w:val="22"/>
-              </w:rPr>
-            </w:pPr>
-            <w:r>
-              <w:rPr>
-                <w:sz w:val="20"/>
-                <w:szCs w:val="22"/>
-              </w:rPr>
-              <w:t xml:space="preserve">En tant qu'animateur de la partie, je veux que l'application enregistre un fichier JSON avec la difficulté de chaque fonctionnalité quand tout le </w:t>
-            </w:r>
-            <w:proofErr w:type="spellStart"/>
-            <w:r>
-              <w:rPr>
-                <w:sz w:val="20"/>
-                <w:szCs w:val="22"/>
-              </w:rPr>
-              <w:t>backlog</w:t>
-            </w:r>
-            <w:proofErr w:type="spellEnd"/>
-            <w:r>
-              <w:rPr>
-                <w:sz w:val="20"/>
-                <w:szCs w:val="22"/>
-              </w:rPr>
-              <w:t xml:space="preserve"> est estimé, afin de reporter les estimations dans notre outil de suivi.</w:t>
+              <w:t>En tant qu'animateur de la partie, je veux que l'application enregistre un fichier JSON avec la difficulté de chaque fonctionnalité quand tout le backlog est estimé, afin de reporter les estimations dans notre outil de suivi.</w:t>
             </w:r>
           </w:p>
         </w:tc>
@@ -2697,15 +2665,7 @@
     </w:p>
     <w:p>
       <w:r>
-        <w:t xml:space="preserve">Étant donné un </w:t>
-      </w:r>
-      <w:proofErr w:type="spellStart"/>
-      <w:r>
-        <w:t>backlog</w:t>
-      </w:r>
-      <w:proofErr w:type="spellEnd"/>
-      <w:r>
-        <w:t xml:space="preserve"> de 3 fonctionnalités dont 2 validées, quand la 3e est validée avec la difficulté, alors un fichier JSON est enregistré contenant les 3 fonctionnalités et leur difficulté.</w:t>
+        <w:t>Étant donné un backlog de 3 fonctionnalités dont 2 validées, quand la 3e est validée avec la difficulté, alors un fichier JSON est enregistré contenant les 3 fonctionnalités et leur difficulté.</w:t>
       </w:r>
     </w:p>
     <w:p>
@@ -4093,9 +4053,11 @@
             <w:tcW w:w="3021" w:type="dxa"/>
           </w:tcPr>
           <w:p>
+            <w:proofErr w:type="gramStart"/>
             <w:r>
               <w:t>½</w:t>
             </w:r>
+            <w:proofErr w:type="gramEnd"/>
           </w:p>
         </w:tc>
         <w:tc>
@@ -4125,9 +4087,11 @@
             <w:tcW w:w="3021" w:type="dxa"/>
           </w:tcPr>
           <w:p>
+            <w:proofErr w:type="gramStart"/>
             <w:r>
               <w:t>½</w:t>
             </w:r>
+            <w:proofErr w:type="gramEnd"/>
           </w:p>
         </w:tc>
         <w:tc>
@@ -4135,9 +4099,11 @@
             <w:tcW w:w="3021" w:type="dxa"/>
           </w:tcPr>
           <w:p>
+            <w:proofErr w:type="gramStart"/>
             <w:r>
               <w:t>½</w:t>
             </w:r>
+            <w:proofErr w:type="gramEnd"/>
           </w:p>
         </w:tc>
       </w:tr>
@@ -4182,16 +4148,442 @@
         <w:t>Objectif du sprint 1 :</w:t>
       </w:r>
       <w:r>
-        <w:t xml:space="preserve"> Une équipe réunie autour d’un même ordinateur peut lancer une partie avec ses pseudos, charger son </w:t>
-      </w:r>
-      <w:proofErr w:type="spellStart"/>
-      <w:r>
-        <w:t>backlog</w:t>
-      </w:r>
-      <w:proofErr w:type="spellEnd"/>
-      <w:r>
-        <w:t xml:space="preserve"> et voter en secret sur chaque fonctionnalité, puis découvrir tous les votes en même temps.</w:t>
-      </w:r>
+        <w:t xml:space="preserve"> Une équipe réunie autour d’un même ordinateur peut lancer une partie avec ses pseudos, charger son backlog et voter en secret sur chaque fonctionnalité, puis découvrir tous les votes en même temps.</w:t>
+      </w:r>
+    </w:p>
+    <w:p>
+      <w:pPr>
+        <w:tabs>
+          <w:tab w:val="left" w:pos="1545"/>
+        </w:tabs>
+      </w:pPr>
+    </w:p>
+    <w:p>
+      <w:pPr>
+        <w:pStyle w:val="Titre1"/>
+      </w:pPr>
+      <w:r>
+        <w:t>Definition of Done</w:t>
+      </w:r>
+    </w:p>
+    <w:p>
+      <w:pPr>
+        <w:tabs>
+          <w:tab w:val="left" w:pos="1545"/>
+        </w:tabs>
+      </w:pPr>
+      <w:r>
+        <w:t>Une user story est terminée quand toutes les conditions suivantes sont vraies. Chaque condition peut être vérifiée par quelqu’un d’extérieur au binôme.</w:t>
+      </w:r>
+    </w:p>
+    <w:tbl>
+      <w:tblPr>
+        <w:tblStyle w:val="Tableausimple1"/>
+        <w:tblW w:w="0" w:type="auto"/>
+        <w:tblLook w:val="04A0" w:firstRow="1" w:lastRow="0" w:firstColumn="1" w:lastColumn="0" w:noHBand="0" w:noVBand="1"/>
+      </w:tblPr>
+      <w:tblGrid>
+        <w:gridCol w:w="338"/>
+        <w:gridCol w:w="3284"/>
+        <w:gridCol w:w="5440"/>
+      </w:tblGrid>
+      <w:tr>
+        <w:trPr>
+          <w:cnfStyle w:val="100000000000" w:firstRow="1" w:lastRow="0" w:firstColumn="0" w:lastColumn="0" w:oddVBand="0" w:evenVBand="0" w:oddHBand="0" w:evenHBand="0" w:firstRowFirstColumn="0" w:firstRowLastColumn="0" w:lastRowFirstColumn="0" w:lastRowLastColumn="0"/>
+        </w:trPr>
+        <w:tc>
+          <w:tcPr>
+            <w:cnfStyle w:val="001000000000" w:firstRow="0" w:lastRow="0" w:firstColumn="1" w:lastColumn="0" w:oddVBand="0" w:evenVBand="0" w:oddHBand="0" w:evenHBand="0" w:firstRowFirstColumn="0" w:firstRowLastColumn="0" w:lastRowFirstColumn="0" w:lastRowLastColumn="0"/>
+            <w:tcW w:w="0" w:type="auto"/>
+            <w:hideMark/>
+          </w:tcPr>
+          <w:p>
+            <w:pPr>
+              <w:tabs>
+                <w:tab w:val="left" w:pos="1545"/>
+              </w:tabs>
+              <w:spacing w:after="160" w:line="278" w:lineRule="auto"/>
+            </w:pPr>
+          </w:p>
+        </w:tc>
+        <w:tc>
+          <w:tcPr>
+            <w:tcW w:w="0" w:type="auto"/>
+            <w:hideMark/>
+          </w:tcPr>
+          <w:p>
+            <w:pPr>
+              <w:tabs>
+                <w:tab w:val="left" w:pos="1545"/>
+              </w:tabs>
+              <w:spacing w:after="160" w:line="278" w:lineRule="auto"/>
+              <w:cnfStyle w:val="100000000000" w:firstRow="1" w:lastRow="0" w:firstColumn="0" w:lastColumn="0" w:oddVBand="0" w:evenVBand="0" w:oddHBand="0" w:evenHBand="0" w:firstRowFirstColumn="0" w:firstRowLastColumn="0" w:lastRowFirstColumn="0" w:lastRowLastColumn="0"/>
+            </w:pPr>
+            <w:r>
+              <w:t>Condition</w:t>
+            </w:r>
+          </w:p>
+        </w:tc>
+        <w:tc>
+          <w:tcPr>
+            <w:tcW w:w="0" w:type="auto"/>
+            <w:hideMark/>
+          </w:tcPr>
+          <w:p>
+            <w:pPr>
+              <w:tabs>
+                <w:tab w:val="left" w:pos="1545"/>
+              </w:tabs>
+              <w:spacing w:after="160" w:line="278" w:lineRule="auto"/>
+              <w:cnfStyle w:val="100000000000" w:firstRow="1" w:lastRow="0" w:firstColumn="0" w:lastColumn="0" w:oddVBand="0" w:evenVBand="0" w:oddHBand="0" w:evenHBand="0" w:firstRowFirstColumn="0" w:firstRowLastColumn="0" w:lastRowFirstColumn="0" w:lastRowLastColumn="0"/>
+            </w:pPr>
+            <w:r>
+              <w:t>Comment on la vérifie</w:t>
+            </w:r>
+          </w:p>
+        </w:tc>
+      </w:tr>
+      <w:tr>
+        <w:trPr>
+          <w:cnfStyle w:val="000000100000" w:firstRow="0" w:lastRow="0" w:firstColumn="0" w:lastColumn="0" w:oddVBand="0" w:evenVBand="0" w:oddHBand="1" w:evenHBand="0" w:firstRowFirstColumn="0" w:firstRowLastColumn="0" w:lastRowFirstColumn="0" w:lastRowLastColumn="0"/>
+        </w:trPr>
+        <w:tc>
+          <w:tcPr>
+            <w:cnfStyle w:val="001000000000" w:firstRow="0" w:lastRow="0" w:firstColumn="1" w:lastColumn="0" w:oddVBand="0" w:evenVBand="0" w:oddHBand="0" w:evenHBand="0" w:firstRowFirstColumn="0" w:firstRowLastColumn="0" w:lastRowFirstColumn="0" w:lastRowLastColumn="0"/>
+            <w:tcW w:w="0" w:type="auto"/>
+            <w:hideMark/>
+          </w:tcPr>
+          <w:p>
+            <w:pPr>
+              <w:tabs>
+                <w:tab w:val="left" w:pos="1545"/>
+              </w:tabs>
+              <w:spacing w:after="160" w:line="278" w:lineRule="auto"/>
+            </w:pPr>
+            <w:r>
+              <w:t>1</w:t>
+            </w:r>
+          </w:p>
+        </w:tc>
+        <w:tc>
+          <w:tcPr>
+            <w:tcW w:w="0" w:type="auto"/>
+            <w:hideMark/>
+          </w:tcPr>
+          <w:p>
+            <w:pPr>
+              <w:tabs>
+                <w:tab w:val="left" w:pos="1545"/>
+              </w:tabs>
+              <w:spacing w:after="160" w:line="278" w:lineRule="auto"/>
+              <w:cnfStyle w:val="000000100000" w:firstRow="0" w:lastRow="0" w:firstColumn="0" w:lastColumn="0" w:oddVBand="0" w:evenVBand="0" w:oddHBand="1" w:evenHBand="0" w:firstRowFirstColumn="0" w:firstRowLastColumn="0" w:lastRowFirstColumn="0" w:lastRowLastColumn="0"/>
+            </w:pPr>
+            <w:r>
+              <w:t>Les critères d’acceptation de l’US sont satisfaits</w:t>
+            </w:r>
+          </w:p>
+        </w:tc>
+        <w:tc>
+          <w:tcPr>
+            <w:tcW w:w="0" w:type="auto"/>
+            <w:hideMark/>
+          </w:tcPr>
+          <w:p>
+            <w:pPr>
+              <w:tabs>
+                <w:tab w:val="left" w:pos="1545"/>
+              </w:tabs>
+              <w:spacing w:after="160" w:line="278" w:lineRule="auto"/>
+              <w:cnfStyle w:val="000000100000" w:firstRow="0" w:lastRow="0" w:firstColumn="0" w:lastColumn="0" w:oddVBand="0" w:evenVBand="0" w:oddHBand="1" w:evenHBand="0" w:firstRowFirstColumn="0" w:firstRowLastColumn="0" w:lastRowFirstColumn="0" w:lastRowLastColumn="0"/>
+            </w:pPr>
+            <w:r>
+              <w:t>Un test xUnit par critère, nommé avec son identifiant (CA_05_2_...) : dotnet test les exécute tous et réussit</w:t>
+            </w:r>
+          </w:p>
+        </w:tc>
+      </w:tr>
+      <w:tr>
+        <w:tc>
+          <w:tcPr>
+            <w:cnfStyle w:val="001000000000" w:firstRow="0" w:lastRow="0" w:firstColumn="1" w:lastColumn="0" w:oddVBand="0" w:evenVBand="0" w:oddHBand="0" w:evenHBand="0" w:firstRowFirstColumn="0" w:firstRowLastColumn="0" w:lastRowFirstColumn="0" w:lastRowLastColumn="0"/>
+            <w:tcW w:w="0" w:type="auto"/>
+            <w:hideMark/>
+          </w:tcPr>
+          <w:p>
+            <w:pPr>
+              <w:tabs>
+                <w:tab w:val="left" w:pos="1545"/>
+              </w:tabs>
+              <w:spacing w:after="160" w:line="278" w:lineRule="auto"/>
+            </w:pPr>
+            <w:r>
+              <w:t>2</w:t>
+            </w:r>
+          </w:p>
+        </w:tc>
+        <w:tc>
+          <w:tcPr>
+            <w:tcW w:w="0" w:type="auto"/>
+            <w:hideMark/>
+          </w:tcPr>
+          <w:p>
+            <w:pPr>
+              <w:tabs>
+                <w:tab w:val="left" w:pos="1545"/>
+              </w:tabs>
+              <w:spacing w:after="160" w:line="278" w:lineRule="auto"/>
+              <w:cnfStyle w:val="000000000000" w:firstRow="0" w:lastRow="0" w:firstColumn="0" w:lastColumn="0" w:oddVBand="0" w:evenVBand="0" w:oddHBand="0" w:evenHBand="0" w:firstRowFirstColumn="0" w:firstRowLastColumn="0" w:lastRowFirstColumn="0" w:lastRowLastColumn="0"/>
+            </w:pPr>
+            <w:r>
+              <w:t>Le code est arrivé sur main par une PR relue par le copilote</w:t>
+            </w:r>
+          </w:p>
+        </w:tc>
+        <w:tc>
+          <w:tcPr>
+            <w:tcW w:w="0" w:type="auto"/>
+            <w:hideMark/>
+          </w:tcPr>
+          <w:p>
+            <w:pPr>
+              <w:tabs>
+                <w:tab w:val="left" w:pos="1545"/>
+              </w:tabs>
+              <w:spacing w:after="160" w:line="278" w:lineRule="auto"/>
+              <w:cnfStyle w:val="000000000000" w:firstRow="0" w:lastRow="0" w:firstColumn="0" w:lastColumn="0" w:oddVBand="0" w:evenVBand="0" w:oddHBand="0" w:evenHBand="0" w:firstRowFirstColumn="0" w:firstRowLastColumn="0" w:lastRowFirstColumn="0" w:lastRowLastColumn="0"/>
+            </w:pPr>
+            <w:r>
+              <w:t>La PR « US-xx : ... » porte un commentaire ou une approbation du copilote, et ferme l’issue de l’US, qui passe dans « Terminé »</w:t>
+            </w:r>
+          </w:p>
+        </w:tc>
+      </w:tr>
+      <w:tr>
+        <w:trPr>
+          <w:cnfStyle w:val="000000100000" w:firstRow="0" w:lastRow="0" w:firstColumn="0" w:lastColumn="0" w:oddVBand="0" w:evenVBand="0" w:oddHBand="1" w:evenHBand="0" w:firstRowFirstColumn="0" w:firstRowLastColumn="0" w:lastRowFirstColumn="0" w:lastRowLastColumn="0"/>
+        </w:trPr>
+        <w:tc>
+          <w:tcPr>
+            <w:cnfStyle w:val="001000000000" w:firstRow="0" w:lastRow="0" w:firstColumn="1" w:lastColumn="0" w:oddVBand="0" w:evenVBand="0" w:oddHBand="0" w:evenHBand="0" w:firstRowFirstColumn="0" w:firstRowLastColumn="0" w:lastRowFirstColumn="0" w:lastRowLastColumn="0"/>
+            <w:tcW w:w="0" w:type="auto"/>
+            <w:hideMark/>
+          </w:tcPr>
+          <w:p>
+            <w:pPr>
+              <w:tabs>
+                <w:tab w:val="left" w:pos="1545"/>
+              </w:tabs>
+              <w:spacing w:after="160" w:line="278" w:lineRule="auto"/>
+            </w:pPr>
+            <w:r>
+              <w:t>3</w:t>
+            </w:r>
+          </w:p>
+        </w:tc>
+        <w:tc>
+          <w:tcPr>
+            <w:tcW w:w="0" w:type="auto"/>
+            <w:hideMark/>
+          </w:tcPr>
+          <w:p>
+            <w:pPr>
+              <w:tabs>
+                <w:tab w:val="left" w:pos="1545"/>
+              </w:tabs>
+              <w:spacing w:after="160" w:line="278" w:lineRule="auto"/>
+              <w:cnfStyle w:val="000000100000" w:firstRow="0" w:lastRow="0" w:firstColumn="0" w:lastColumn="0" w:oddVBand="0" w:evenVBand="0" w:oddHBand="1" w:evenHBand="0" w:firstRowFirstColumn="0" w:firstRowLastColumn="0" w:lastRowFirstColumn="0" w:lastRowLastColumn="0"/>
+            </w:pPr>
+            <w:r>
+              <w:t>Les tests passent</w:t>
+            </w:r>
+          </w:p>
+        </w:tc>
+        <w:tc>
+          <w:tcPr>
+            <w:tcW w:w="0" w:type="auto"/>
+            <w:hideMark/>
+          </w:tcPr>
+          <w:p>
+            <w:pPr>
+              <w:tabs>
+                <w:tab w:val="left" w:pos="1545"/>
+              </w:tabs>
+              <w:spacing w:after="160" w:line="278" w:lineRule="auto"/>
+              <w:cnfStyle w:val="000000100000" w:firstRow="0" w:lastRow="0" w:firstColumn="0" w:lastColumn="0" w:oddVBand="0" w:evenVBand="0" w:oddHBand="1" w:evenHBand="0" w:firstRowFirstColumn="0" w:firstRowLastColumn="0" w:lastRowFirstColumn="0" w:lastRowLastColumn="0"/>
+            </w:pPr>
+            <w:r>
+              <w:t>La commande de test du README réussit ; la CI est verte (à partir de la séance 2)</w:t>
+            </w:r>
+          </w:p>
+        </w:tc>
+      </w:tr>
+      <w:tr>
+        <w:tc>
+          <w:tcPr>
+            <w:cnfStyle w:val="001000000000" w:firstRow="0" w:lastRow="0" w:firstColumn="1" w:lastColumn="0" w:oddVBand="0" w:evenVBand="0" w:oddHBand="0" w:evenHBand="0" w:firstRowFirstColumn="0" w:firstRowLastColumn="0" w:lastRowFirstColumn="0" w:lastRowLastColumn="0"/>
+            <w:tcW w:w="0" w:type="auto"/>
+            <w:hideMark/>
+          </w:tcPr>
+          <w:p>
+            <w:pPr>
+              <w:tabs>
+                <w:tab w:val="left" w:pos="1545"/>
+              </w:tabs>
+              <w:spacing w:after="160" w:line="278" w:lineRule="auto"/>
+            </w:pPr>
+            <w:r>
+              <w:t>4</w:t>
+            </w:r>
+          </w:p>
+        </w:tc>
+        <w:tc>
+          <w:tcPr>
+            <w:tcW w:w="0" w:type="auto"/>
+            <w:hideMark/>
+          </w:tcPr>
+          <w:p>
+            <w:pPr>
+              <w:tabs>
+                <w:tab w:val="left" w:pos="1545"/>
+              </w:tabs>
+              <w:spacing w:after="160" w:line="278" w:lineRule="auto"/>
+              <w:cnfStyle w:val="000000000000" w:firstRow="0" w:lastRow="0" w:firstColumn="0" w:lastColumn="0" w:oddVBand="0" w:evenVBand="0" w:oddHBand="0" w:evenHBand="0" w:firstRowFirstColumn="0" w:firstRowLastColumn="0" w:lastRowFirstColumn="0" w:lastRowLastColumn="0"/>
+            </w:pPr>
+            <w:r>
+              <w:t>Le README est à jour si la façon de lancer ou de tester a changé</w:t>
+            </w:r>
+          </w:p>
+        </w:tc>
+        <w:tc>
+          <w:tcPr>
+            <w:tcW w:w="0" w:type="auto"/>
+            <w:hideMark/>
+          </w:tcPr>
+          <w:p>
+            <w:pPr>
+              <w:tabs>
+                <w:tab w:val="left" w:pos="1545"/>
+              </w:tabs>
+              <w:spacing w:after="160" w:line="278" w:lineRule="auto"/>
+              <w:cnfStyle w:val="000000000000" w:firstRow="0" w:lastRow="0" w:firstColumn="0" w:lastColumn="0" w:oddVBand="0" w:evenVBand="0" w:oddHBand="0" w:evenHBand="0" w:firstRowFirstColumn="0" w:firstRowLastColumn="0" w:lastRowFirstColumn="0" w:lastRowLastColumn="0"/>
+            </w:pPr>
+            <w:r>
+              <w:t>Les commandes du README fonctionnent après un git clone</w:t>
+            </w:r>
+          </w:p>
+        </w:tc>
+      </w:tr>
+      <w:tr>
+        <w:trPr>
+          <w:cnfStyle w:val="000000100000" w:firstRow="0" w:lastRow="0" w:firstColumn="0" w:lastColumn="0" w:oddVBand="0" w:evenVBand="0" w:oddHBand="1" w:evenHBand="0" w:firstRowFirstColumn="0" w:firstRowLastColumn="0" w:lastRowFirstColumn="0" w:lastRowLastColumn="0"/>
+        </w:trPr>
+        <w:tc>
+          <w:tcPr>
+            <w:cnfStyle w:val="001000000000" w:firstRow="0" w:lastRow="0" w:firstColumn="1" w:lastColumn="0" w:oddVBand="0" w:evenVBand="0" w:oddHBand="0" w:evenHBand="0" w:firstRowFirstColumn="0" w:firstRowLastColumn="0" w:lastRowFirstColumn="0" w:lastRowLastColumn="0"/>
+            <w:tcW w:w="0" w:type="auto"/>
+            <w:hideMark/>
+          </w:tcPr>
+          <w:p>
+            <w:pPr>
+              <w:tabs>
+                <w:tab w:val="left" w:pos="1545"/>
+              </w:tabs>
+              <w:spacing w:after="160" w:line="278" w:lineRule="auto"/>
+            </w:pPr>
+            <w:r>
+              <w:t>5</w:t>
+            </w:r>
+          </w:p>
+        </w:tc>
+        <w:tc>
+          <w:tcPr>
+            <w:tcW w:w="0" w:type="auto"/>
+            <w:hideMark/>
+          </w:tcPr>
+          <w:p>
+            <w:pPr>
+              <w:tabs>
+                <w:tab w:val="left" w:pos="1545"/>
+              </w:tabs>
+              <w:spacing w:after="160" w:line="278" w:lineRule="auto"/>
+              <w:cnfStyle w:val="000000100000" w:firstRow="0" w:lastRow="0" w:firstColumn="0" w:lastColumn="0" w:oddVBand="0" w:evenVBand="0" w:oddHBand="1" w:evenHBand="0" w:firstRowFirstColumn="0" w:firstRowLastColumn="0" w:lastRowFirstColumn="0" w:lastRowLastColumn="0"/>
+            </w:pPr>
+            <w:r>
+              <w:t>Si l’IA a servi, une entrée existe dans AI_LOG.md</w:t>
+            </w:r>
+          </w:p>
+        </w:tc>
+        <w:tc>
+          <w:tcPr>
+            <w:tcW w:w="0" w:type="auto"/>
+            <w:hideMark/>
+          </w:tcPr>
+          <w:p>
+            <w:pPr>
+              <w:tabs>
+                <w:tab w:val="left" w:pos="1545"/>
+              </w:tabs>
+              <w:spacing w:after="160" w:line="278" w:lineRule="auto"/>
+              <w:cnfStyle w:val="000000100000" w:firstRow="0" w:lastRow="0" w:firstColumn="0" w:lastColumn="0" w:oddVBand="0" w:evenVBand="0" w:oddHBand="1" w:evenHBand="0" w:firstRowFirstColumn="0" w:firstRowLastColumn="0" w:lastRowFirstColumn="0" w:lastRowLastColumn="0"/>
+            </w:pPr>
+            <w:r>
+              <w:t>L’entrée cite l’US</w:t>
+            </w:r>
+          </w:p>
+        </w:tc>
+      </w:tr>
+    </w:tbl>
+    <w:p>
+      <w:pPr>
+        <w:tabs>
+          <w:tab w:val="left" w:pos="1545"/>
+        </w:tabs>
+        <w:rPr>
+          <w:b/>
+          <w:bCs/>
+        </w:rPr>
+      </w:pPr>
+    </w:p>
+    <w:p>
+      <w:pPr>
+        <w:tabs>
+          <w:tab w:val="left" w:pos="1545"/>
+        </w:tabs>
+      </w:pPr>
+      <w:r>
+        <w:rPr>
+          <w:b/>
+          <w:bCs/>
+        </w:rPr>
+        <w:t>Conditions adaptées par rapport au modèle :</w:t>
+      </w:r>
+      <w:r>
+        <w:t xml:space="preserve"> la condition 1 exige un test par critère, sans essai à la main, car un essai à la main ne se vérifie pas de l’extérieur. La condition 2 impose une relecture dans une PR qui ferme l’issue, ce qui tient aussi le tableau à jour.</w:t>
+      </w:r>
+    </w:p>
+    <w:p>
+      <w:pPr>
+        <w:tabs>
+          <w:tab w:val="left" w:pos="1545"/>
+        </w:tabs>
+      </w:pPr>
+      <w:r>
+        <w:rPr>
+          <w:b/>
+          <w:bCs/>
+        </w:rPr>
+        <w:t>Écart assumé au sprint 1 :</w:t>
+      </w:r>
+      <w:r>
+        <w:t xml:space="preserve"> les US du walking skeleton (US-01, US-03, US-05) ne respectent pas les conditions 1 et 3, car aucun projet de tests xUnit n’a été créé. Le temps de la séance devait couvrir trois fonctionnalités de bout en bout, et nous avons donné la priorité à une version qui se lance. Le projet de tests sera créé en séance 2, avec les tests du moteur de règles écrits avant le code.</w:t>
+      </w:r>
+    </w:p>
+    <w:p>
+      <w:pPr>
+        <w:tabs>
+          <w:tab w:val="left" w:pos="1545"/>
+        </w:tabs>
+      </w:pPr>
     </w:p>
     <w:sectPr>
       <w:headerReference w:type="default" r:id="rId9"/>
@@ -7914,6 +8306,126 @@
       </w:tblBorders>
     </w:tblPr>
   </w:style>
+  <w:style w:type="table" w:styleId="TableauGrille1Clair">
+    <w:name w:val="Grid Table 1 Light"/>
+    <w:basedOn w:val="TableauNormal"/>
+    <w:uiPriority w:val="46"/>
+    <w:rsid w:val="00186695"/>
+    <w:pPr>
+      <w:spacing w:after="0" w:line="240" w:lineRule="auto"/>
+    </w:pPr>
+    <w:tblPr>
+      <w:tblStyleRowBandSize w:val="1"/>
+      <w:tblStyleColBandSize w:val="1"/>
+      <w:tblBorders>
+        <w:top w:val="single" w:sz="4" w:space="0" w:color="999999" w:themeColor="text1" w:themeTint="66"/>
+        <w:left w:val="single" w:sz="4" w:space="0" w:color="999999" w:themeColor="text1" w:themeTint="66"/>
+        <w:bottom w:val="single" w:sz="4" w:space="0" w:color="999999" w:themeColor="text1" w:themeTint="66"/>
+        <w:right w:val="single" w:sz="4" w:space="0" w:color="999999" w:themeColor="text1" w:themeTint="66"/>
+        <w:insideH w:val="single" w:sz="4" w:space="0" w:color="999999" w:themeColor="text1" w:themeTint="66"/>
+        <w:insideV w:val="single" w:sz="4" w:space="0" w:color="999999" w:themeColor="text1" w:themeTint="66"/>
+      </w:tblBorders>
+    </w:tblPr>
+    <w:tblStylePr w:type="firstRow">
+      <w:rPr>
+        <w:b/>
+        <w:bCs/>
+      </w:rPr>
+      <w:tblPr/>
+      <w:tcPr>
+        <w:tcBorders>
+          <w:bottom w:val="single" w:sz="12" w:space="0" w:color="666666" w:themeColor="text1" w:themeTint="99"/>
+        </w:tcBorders>
+      </w:tcPr>
+    </w:tblStylePr>
+    <w:tblStylePr w:type="lastRow">
+      <w:rPr>
+        <w:b/>
+        <w:bCs/>
+      </w:rPr>
+      <w:tblPr/>
+      <w:tcPr>
+        <w:tcBorders>
+          <w:top w:val="double" w:sz="2" w:space="0" w:color="666666" w:themeColor="text1" w:themeTint="99"/>
+        </w:tcBorders>
+      </w:tcPr>
+    </w:tblStylePr>
+    <w:tblStylePr w:type="firstCol">
+      <w:rPr>
+        <w:b/>
+        <w:bCs/>
+      </w:rPr>
+    </w:tblStylePr>
+    <w:tblStylePr w:type="lastCol">
+      <w:rPr>
+        <w:b/>
+        <w:bCs/>
+      </w:rPr>
+    </w:tblStylePr>
+  </w:style>
+  <w:style w:type="table" w:styleId="Tableausimple1">
+    <w:name w:val="Plain Table 1"/>
+    <w:basedOn w:val="TableauNormal"/>
+    <w:uiPriority w:val="41"/>
+    <w:rsid w:val="00186695"/>
+    <w:pPr>
+      <w:spacing w:after="0" w:line="240" w:lineRule="auto"/>
+    </w:pPr>
+    <w:tblPr>
+      <w:tblStyleRowBandSize w:val="1"/>
+      <w:tblStyleColBandSize w:val="1"/>
+      <w:tblBorders>
+        <w:top w:val="single" w:sz="4" w:space="0" w:color="BFBFBF" w:themeColor="background1" w:themeShade="BF"/>
+        <w:left w:val="single" w:sz="4" w:space="0" w:color="BFBFBF" w:themeColor="background1" w:themeShade="BF"/>
+        <w:bottom w:val="single" w:sz="4" w:space="0" w:color="BFBFBF" w:themeColor="background1" w:themeShade="BF"/>
+        <w:right w:val="single" w:sz="4" w:space="0" w:color="BFBFBF" w:themeColor="background1" w:themeShade="BF"/>
+        <w:insideH w:val="single" w:sz="4" w:space="0" w:color="BFBFBF" w:themeColor="background1" w:themeShade="BF"/>
+        <w:insideV w:val="single" w:sz="4" w:space="0" w:color="BFBFBF" w:themeColor="background1" w:themeShade="BF"/>
+      </w:tblBorders>
+    </w:tblPr>
+    <w:tblStylePr w:type="firstRow">
+      <w:rPr>
+        <w:b/>
+        <w:bCs/>
+      </w:rPr>
+    </w:tblStylePr>
+    <w:tblStylePr w:type="lastRow">
+      <w:rPr>
+        <w:b/>
+        <w:bCs/>
+      </w:rPr>
+      <w:tblPr/>
+      <w:tcPr>
+        <w:tcBorders>
+          <w:top w:val="double" w:sz="4" w:space="0" w:color="BFBFBF" w:themeColor="background1" w:themeShade="BF"/>
+        </w:tcBorders>
+      </w:tcPr>
+    </w:tblStylePr>
+    <w:tblStylePr w:type="firstCol">
+      <w:rPr>
+        <w:b/>
+        <w:bCs/>
+      </w:rPr>
+    </w:tblStylePr>
+    <w:tblStylePr w:type="lastCol">
+      <w:rPr>
+        <w:b/>
+        <w:bCs/>
+      </w:rPr>
+    </w:tblStylePr>
+    <w:tblStylePr w:type="band1Vert">
+      <w:tblPr/>
+      <w:tcPr>
+        <w:shd w:val="clear" w:color="auto" w:fill="F2F2F2" w:themeFill="background1" w:themeFillShade="F2"/>
+      </w:tcPr>
+    </w:tblStylePr>
+    <w:tblStylePr w:type="band1Horz">
+      <w:tblPr/>
+      <w:tcPr>
+        <w:shd w:val="clear" w:color="auto" w:fill="F2F2F2" w:themeFill="background1" w:themeFillShade="F2"/>
+      </w:tcPr>
+    </w:tblStylePr>
+  </w:style>
 </w:styles>
 </file>
 
@@ -8184,10 +8696,12 @@
     <w:rsidRoot w:val="006E64CE"/>
     <w:rsid w:val="00113869"/>
     <w:rsid w:val="002F62BC"/>
+    <w:rsid w:val="0042725B"/>
     <w:rsid w:val="004F31F8"/>
     <w:rsid w:val="005259C0"/>
     <w:rsid w:val="006E64CE"/>
     <w:rsid w:val="00785775"/>
+    <w:rsid w:val="008B2538"/>
     <w:rsid w:val="00B021F1"/>
     <w:rsid w:val="00E71964"/>
     <w:rsid w:val="00FF69E9"/>

</xml_diff>